<commit_message>
Termwork 5 output fixed
</commit_message>
<xml_diff>
--- a/DAA/OUTPUTS/TERMWORK 5 OUTPUT.docx
+++ b/DAA/OUTPUTS/TERMWORK 5 OUTPUT.docx
@@ -7,13 +7,8 @@
         <w:jc w:val="center"/>
       </w:pPr>
       <w:r>
-        <w:t xml:space="preserve">TERMWORK </w:t>
+        <w:t>TERMWORK 5</w:t>
       </w:r>
-      <w:r>
-        <w:t>5</w:t>
-      </w:r>
-      <w:bookmarkStart w:id="0" w:name="_GoBack"/>
-      <w:bookmarkEnd w:id="0"/>
     </w:p>
     <w:p>
       <w:pPr>
@@ -63,9 +58,9 @@
           <w:lang w:eastAsia="en-IN"/>
         </w:rPr>
         <w:drawing>
-          <wp:inline distT="0" distB="0" distL="0" distR="0" wp14:anchorId="6651C230" wp14:editId="7FD3D06F">
-            <wp:extent cx="5731510" cy="2898775"/>
-            <wp:effectExtent l="0" t="0" r="2540" b="0"/>
+          <wp:inline distT="0" distB="0" distL="0" distR="0" wp14:anchorId="73A05F67" wp14:editId="3B2C0484">
+            <wp:extent cx="4171950" cy="4279613"/>
+            <wp:effectExtent l="0" t="0" r="0" b="6985"/>
             <wp:docPr id="1" name="Picture 1"/>
             <wp:cNvGraphicFramePr>
               <a:graphicFrameLocks xmlns:a="http://schemas.openxmlformats.org/drawingml/2006/main" noChangeAspect="1"/>
@@ -86,7 +81,7 @@
                   <pic:spPr>
                     <a:xfrm>
                       <a:off x="0" y="0"/>
-                      <a:ext cx="5731510" cy="2898775"/>
+                      <a:ext cx="4186095" cy="4294123"/>
                     </a:xfrm>
                     <a:prstGeom prst="rect">
                       <a:avLst/>
@@ -98,6 +93,8 @@
           </wp:inline>
         </w:drawing>
       </w:r>
+      <w:bookmarkStart w:id="0" w:name="_GoBack"/>
+      <w:bookmarkEnd w:id="0"/>
     </w:p>
     <w:sectPr>
       <w:pgSz w:w="11906" w:h="16838"/>

</xml_diff>